<commit_message>
Added user input for search
Added code for the user to input a number to search the array for, loops 5 times.
</commit_message>
<xml_diff>
--- a/Version Control.docx
+++ b/Version Control.docx
@@ -248,183 +248,6 @@
     </w:p>
     <w:p>
       <w:pPr>
-        <w:pStyle w:val="ListParagraph"/>
-        <w:numPr>
-          <w:ilvl w:val="0"/>
-          <w:numId w:val="6"/>
-        </w:numPr>
-      </w:pPr>
-      <w:sdt>
-        <w:sdtPr>
-          <w:id w:val="489138210"/>
-          <w:placeholder>
-            <w:docPart w:val="B8D516889DAA49C382A1648045C7EF4E"/>
-          </w:placeholder>
-          <w:showingPlcHdr/>
-        </w:sdtPr>
-        <w:sdtContent>
-          <w:r>
-            <w:rPr>
-              <w:rStyle w:val="PlaceholderText"/>
-              <w:color w:val="auto"/>
-            </w:rPr>
-            <w:t>Name of resource</w:t>
-          </w:r>
-        </w:sdtContent>
-      </w:sdt>
-      <w:r>
-        <w:t>:</w:t>
-      </w:r>
-      <w:r>
-        <w:rPr>
-          <w:color w:val="FF0000"/>
-        </w:rPr>
-        <w:t xml:space="preserve"> </w:t>
-      </w:r>
-      <w:sdt>
-        <w:sdtPr>
-          <w:id w:val="1913738986"/>
-          <w:placeholder>
-            <w:docPart w:val="5A9145CE42C8478BBCCB1CEE0E4F4481"/>
-          </w:placeholder>
-          <w:showingPlcHdr/>
-        </w:sdtPr>
-        <w:sdtContent>
-          <w:r>
-            <w:rPr>
-              <w:rStyle w:val="PlaceholderText"/>
-            </w:rPr>
-            <w:t>Paste your link here</w:t>
-          </w:r>
-          <w:r>
-            <w:rPr>
-              <w:rStyle w:val="PlaceholderText"/>
-            </w:rPr>
-            <w:t>.</w:t>
-          </w:r>
-        </w:sdtContent>
-      </w:sdt>
-    </w:p>
-    <w:p>
-      <w:pPr>
-        <w:pStyle w:val="ListParagraph"/>
-        <w:numPr>
-          <w:ilvl w:val="0"/>
-          <w:numId w:val="6"/>
-        </w:numPr>
-      </w:pPr>
-      <w:sdt>
-        <w:sdtPr>
-          <w:id w:val="-1327741877"/>
-          <w:placeholder>
-            <w:docPart w:val="CF6031E566304451A8943E7D31AA1C52"/>
-          </w:placeholder>
-          <w:showingPlcHdr/>
-        </w:sdtPr>
-        <w:sdtContent>
-          <w:r>
-            <w:rPr>
-              <w:rStyle w:val="PlaceholderText"/>
-              <w:color w:val="auto"/>
-            </w:rPr>
-            <w:t>Name of resource</w:t>
-          </w:r>
-        </w:sdtContent>
-      </w:sdt>
-      <w:r>
-        <w:t>:</w:t>
-      </w:r>
-      <w:r>
-        <w:rPr>
-          <w:color w:val="FF0000"/>
-        </w:rPr>
-        <w:t xml:space="preserve"> </w:t>
-      </w:r>
-      <w:sdt>
-        <w:sdtPr>
-          <w:id w:val="1051187667"/>
-          <w:placeholder>
-            <w:docPart w:val="B8B605B505684E51BD858D66783BDF7F"/>
-          </w:placeholder>
-          <w:showingPlcHdr/>
-        </w:sdtPr>
-        <w:sdtContent>
-          <w:r>
-            <w:rPr>
-              <w:rStyle w:val="PlaceholderText"/>
-            </w:rPr>
-            <w:t>Paste your link here</w:t>
-          </w:r>
-          <w:r>
-            <w:rPr>
-              <w:rStyle w:val="PlaceholderText"/>
-            </w:rPr>
-            <w:t>.</w:t>
-          </w:r>
-        </w:sdtContent>
-      </w:sdt>
-    </w:p>
-    <w:p>
-      <w:pPr>
-        <w:pStyle w:val="ListParagraph"/>
-        <w:numPr>
-          <w:ilvl w:val="0"/>
-          <w:numId w:val="6"/>
-        </w:numPr>
-      </w:pPr>
-      <w:sdt>
-        <w:sdtPr>
-          <w:id w:val="115649185"/>
-          <w:placeholder>
-            <w:docPart w:val="ACFCCD54B4D1492EAA109C300B9CCF7A"/>
-          </w:placeholder>
-          <w:showingPlcHdr/>
-        </w:sdtPr>
-        <w:sdtContent>
-          <w:r>
-            <w:rPr>
-              <w:rStyle w:val="PlaceholderText"/>
-              <w:color w:val="auto"/>
-            </w:rPr>
-            <w:t>Name of resource</w:t>
-          </w:r>
-        </w:sdtContent>
-      </w:sdt>
-      <w:r>
-        <w:t>:</w:t>
-      </w:r>
-      <w:r>
-        <w:rPr>
-          <w:color w:val="FF0000"/>
-        </w:rPr>
-        <w:t xml:space="preserve"> </w:t>
-      </w:r>
-      <w:sdt>
-        <w:sdtPr>
-          <w:id w:val="1131060476"/>
-          <w:placeholder>
-            <w:docPart w:val="43832A401D544A11B2E3CAE6030736EA"/>
-          </w:placeholder>
-          <w:showingPlcHdr/>
-        </w:sdtPr>
-        <w:sdtContent>
-          <w:r>
-            <w:rPr>
-              <w:rStyle w:val="PlaceholderText"/>
-            </w:rPr>
-            <w:t>Paste your link here</w:t>
-          </w:r>
-          <w:r>
-            <w:rPr>
-              <w:rStyle w:val="PlaceholderText"/>
-            </w:rPr>
-            <w:t>.</w:t>
-          </w:r>
-        </w:sdtContent>
-      </w:sdt>
-    </w:p>
-    <w:p>
-      <w:pPr>
         <w:pStyle w:val="Heading1"/>
       </w:pPr>
       <w:r>
@@ -502,16 +325,11 @@
         <w:placeholder>
           <w:docPart w:val="DefaultPlaceholder_-1854013440"/>
         </w:placeholder>
-        <w:showingPlcHdr/>
       </w:sdtPr>
       <w:sdtContent>
         <w:p>
           <w:r>
-            <w:rPr>
-              <w:rStyle w:val="PlaceholderText"/>
-              <w:color w:val="auto"/>
-            </w:rPr>
-            <w:t>Click or tap here to enter text.</w:t>
+            <w:t>I had alot of confusion over whether to add +1 or -1 to the Start and Length variables, i was thinking it would undesirably give preference to numbers above the Target, but after lots of drawing it all out on a whiteboard realised that’s only because it doesn’t split up as neatly into lower/correct/higher as an odd number, some it would’ve given preference to one side in even inputs no matter what.</w:t>
           </w:r>
         </w:p>
       </w:sdtContent>
@@ -587,16 +405,16 @@
         <w:placeholder>
           <w:docPart w:val="DefaultPlaceholder_-1854013440"/>
         </w:placeholder>
-        <w:showingPlcHdr/>
       </w:sdtPr>
       <w:sdtContent>
         <w:p>
           <w:r>
-            <w:rPr>
-              <w:rStyle w:val="PlaceholderText"/>
-              <w:color w:val="auto"/>
-            </w:rPr>
-            <w:t>Click or tap here to enter text.</w:t>
+            <w:t>Still getting used to my own style.</w:t>
+          </w:r>
+        </w:p>
+        <w:p>
+          <w:r>
+            <w:t>Pushing past mental block, it took me writing the general idea of some of my code on a whiteboard and testing out “looping” it once at a time to really grasp something i was trying to force myself to understand. I did eventually catch the problem and think i will be far less likely to have an issue with it in future, but it definitely took alot longer than it would have if i was properly motivated/focused.</w:t>
           </w:r>
         </w:p>
       </w:sdtContent>
@@ -3042,198 +2860,6 @@
     </w:docPart>
     <w:docPart>
       <w:docPartPr>
-        <w:name w:val="43832A401D544A11B2E3CAE6030736EA"/>
-        <w:category>
-          <w:name w:val="General"/>
-          <w:gallery w:val="placeholder"/>
-        </w:category>
-        <w:types>
-          <w:type w:val="bbPlcHdr"/>
-        </w:types>
-        <w:behaviors>
-          <w:behavior w:val="content"/>
-        </w:behaviors>
-        <w:guid w:val="{A61BC60B-EC6D-44B0-AB0B-986EE2F63624}"/>
-      </w:docPartPr>
-      <w:docPartBody>
-        <w:p>
-          <w:pPr>
-            <w:pStyle w:val="43832A401D544A11B2E3CAE6030736EA"/>
-          </w:pPr>
-          <w:r>
-            <w:rPr>
-              <w:rStyle w:val="PlaceholderText"/>
-            </w:rPr>
-            <w:t>Paste your link here</w:t>
-          </w:r>
-          <w:r>
-            <w:rPr>
-              <w:rStyle w:val="PlaceholderText"/>
-            </w:rPr>
-            <w:t>.</w:t>
-          </w:r>
-        </w:p>
-      </w:docPartBody>
-    </w:docPart>
-    <w:docPart>
-      <w:docPartPr>
-        <w:name w:val="ACFCCD54B4D1492EAA109C300B9CCF7A"/>
-        <w:category>
-          <w:name w:val="General"/>
-          <w:gallery w:val="placeholder"/>
-        </w:category>
-        <w:types>
-          <w:type w:val="bbPlcHdr"/>
-        </w:types>
-        <w:behaviors>
-          <w:behavior w:val="content"/>
-        </w:behaviors>
-        <w:guid w:val="{249990F6-CF37-45B7-BA9F-F5B1062CF986}"/>
-      </w:docPartPr>
-      <w:docPartBody>
-        <w:p>
-          <w:pPr>
-            <w:pStyle w:val="ACFCCD54B4D1492EAA109C300B9CCF7A"/>
-          </w:pPr>
-          <w:r>
-            <w:rPr>
-              <w:rStyle w:val="PlaceholderText"/>
-            </w:rPr>
-            <w:t>Name of resource</w:t>
-          </w:r>
-        </w:p>
-      </w:docPartBody>
-    </w:docPart>
-    <w:docPart>
-      <w:docPartPr>
-        <w:name w:val="CF6031E566304451A8943E7D31AA1C52"/>
-        <w:category>
-          <w:name w:val="General"/>
-          <w:gallery w:val="placeholder"/>
-        </w:category>
-        <w:types>
-          <w:type w:val="bbPlcHdr"/>
-        </w:types>
-        <w:behaviors>
-          <w:behavior w:val="content"/>
-        </w:behaviors>
-        <w:guid w:val="{0FF0B19D-2AF6-4D01-8127-905BE383E39B}"/>
-      </w:docPartPr>
-      <w:docPartBody>
-        <w:p>
-          <w:pPr>
-            <w:pStyle w:val="CF6031E566304451A8943E7D31AA1C52"/>
-          </w:pPr>
-          <w:r>
-            <w:rPr>
-              <w:rStyle w:val="PlaceholderText"/>
-            </w:rPr>
-            <w:t>Name of resource</w:t>
-          </w:r>
-        </w:p>
-      </w:docPartBody>
-    </w:docPart>
-    <w:docPart>
-      <w:docPartPr>
-        <w:name w:val="B8B605B505684E51BD858D66783BDF7F"/>
-        <w:category>
-          <w:name w:val="General"/>
-          <w:gallery w:val="placeholder"/>
-        </w:category>
-        <w:types>
-          <w:type w:val="bbPlcHdr"/>
-        </w:types>
-        <w:behaviors>
-          <w:behavior w:val="content"/>
-        </w:behaviors>
-        <w:guid w:val="{AACDC2F0-13AC-46FE-A930-40E694513172}"/>
-      </w:docPartPr>
-      <w:docPartBody>
-        <w:p>
-          <w:pPr>
-            <w:pStyle w:val="B8B605B505684E51BD858D66783BDF7F"/>
-          </w:pPr>
-          <w:r>
-            <w:rPr>
-              <w:rStyle w:val="PlaceholderText"/>
-            </w:rPr>
-            <w:t>Paste your link here</w:t>
-          </w:r>
-          <w:r>
-            <w:rPr>
-              <w:rStyle w:val="PlaceholderText"/>
-            </w:rPr>
-            <w:t>.</w:t>
-          </w:r>
-        </w:p>
-      </w:docPartBody>
-    </w:docPart>
-    <w:docPart>
-      <w:docPartPr>
-        <w:name w:val="B8D516889DAA49C382A1648045C7EF4E"/>
-        <w:category>
-          <w:name w:val="General"/>
-          <w:gallery w:val="placeholder"/>
-        </w:category>
-        <w:types>
-          <w:type w:val="bbPlcHdr"/>
-        </w:types>
-        <w:behaviors>
-          <w:behavior w:val="content"/>
-        </w:behaviors>
-        <w:guid w:val="{321C3348-00B1-4620-BBAB-A6081EAF6469}"/>
-      </w:docPartPr>
-      <w:docPartBody>
-        <w:p>
-          <w:pPr>
-            <w:pStyle w:val="B8D516889DAA49C382A1648045C7EF4E"/>
-          </w:pPr>
-          <w:r>
-            <w:rPr>
-              <w:rStyle w:val="PlaceholderText"/>
-            </w:rPr>
-            <w:t>Name of resource</w:t>
-          </w:r>
-        </w:p>
-      </w:docPartBody>
-    </w:docPart>
-    <w:docPart>
-      <w:docPartPr>
-        <w:name w:val="5A9145CE42C8478BBCCB1CEE0E4F4481"/>
-        <w:category>
-          <w:name w:val="General"/>
-          <w:gallery w:val="placeholder"/>
-        </w:category>
-        <w:types>
-          <w:type w:val="bbPlcHdr"/>
-        </w:types>
-        <w:behaviors>
-          <w:behavior w:val="content"/>
-        </w:behaviors>
-        <w:guid w:val="{BF45CEA3-6494-4FD6-819C-A15FFEDDDFE2}"/>
-      </w:docPartPr>
-      <w:docPartBody>
-        <w:p>
-          <w:pPr>
-            <w:pStyle w:val="5A9145CE42C8478BBCCB1CEE0E4F4481"/>
-          </w:pPr>
-          <w:r>
-            <w:rPr>
-              <w:rStyle w:val="PlaceholderText"/>
-            </w:rPr>
-            <w:t>Paste your link here</w:t>
-          </w:r>
-          <w:r>
-            <w:rPr>
-              <w:rStyle w:val="PlaceholderText"/>
-            </w:rPr>
-            <w:t>.</w:t>
-          </w:r>
-        </w:p>
-      </w:docPartBody>
-    </w:docPart>
-    <w:docPart>
-      <w:docPartPr>
         <w:name w:val="DF23B91D8A4442A88B65D0165E0EDE26"/>
         <w:category>
           <w:name w:val="General"/>
@@ -3371,12 +2997,14 @@
     <w:rsidRoot w:val="00D1226A"/>
     <w:rsid w:val="0038413C"/>
     <w:rsid w:val="00610C97"/>
+    <w:rsid w:val="007B5075"/>
     <w:rsid w:val="008B0955"/>
     <w:rsid w:val="00980631"/>
     <w:rsid w:val="00A903A6"/>
     <w:rsid w:val="00AC5F97"/>
     <w:rsid w:val="00B56AD6"/>
     <w:rsid w:val="00D1226A"/>
+    <w:rsid w:val="00DD32FF"/>
   </w:rsids>
   <m:mathPr>
     <m:mathFont m:val="Cambria Math"/>
@@ -3845,26 +3473,6 @@
       <w:lang w:eastAsia="en-US"/>
     </w:rPr>
   </w:style>
-  <w:style w:type="paragraph" w:customStyle="1" w:styleId="055B7ABDC6594D37A2D105E64730DB391">
-    <w:name w:val="055B7ABDC6594D37A2D105E64730DB391"/>
-    <w:rsid w:val="00B56AD6"/>
-    <w:pPr>
-      <w:spacing w:after="200" w:line="276" w:lineRule="auto"/>
-    </w:pPr>
-    <w:rPr>
-      <w:lang w:eastAsia="en-US"/>
-    </w:rPr>
-  </w:style>
-  <w:style w:type="paragraph" w:customStyle="1" w:styleId="06FA6E0C26384CDB9A726F9B1A964BC1">
-    <w:name w:val="06FA6E0C26384CDB9A726F9B1A964BC1"/>
-    <w:rsid w:val="00B56AD6"/>
-    <w:pPr>
-      <w:spacing w:after="200" w:line="276" w:lineRule="auto"/>
-    </w:pPr>
-    <w:rPr>
-      <w:lang w:eastAsia="en-US"/>
-    </w:rPr>
-  </w:style>
   <w:style w:type="paragraph" w:customStyle="1" w:styleId="DF23B91D8A4442A88B65D0165E0EDE26">
     <w:name w:val="DF23B91D8A4442A88B65D0165E0EDE26"/>
     <w:rsid w:val="00B56AD6"/>

</xml_diff>

<commit_message>
Finished version control doc
</commit_message>
<xml_diff>
--- a/Version Control.docx
+++ b/Version Control.docx
@@ -174,6 +174,142 @@
           <w:color w:val="FF0000"/>
         </w:rPr>
       </w:pPr>
+      <w:r>
+        <w:rPr>
+          <w:color w:val="FF0000"/>
+        </w:rPr>
+        <w:drawing>
+          <wp:inline distT="0" distB="0" distL="0" distR="0" wp14:anchorId="58228817" wp14:editId="075BF6B6">
+            <wp:extent cx="5731510" cy="6896100"/>
+            <wp:effectExtent l="0" t="0" r="2540" b="0"/>
+            <wp:docPr id="74972581" name="Picture 1"/>
+            <wp:cNvGraphicFramePr>
+              <a:graphicFrameLocks xmlns:a="http://schemas.openxmlformats.org/drawingml/2006/main" noChangeAspect="1"/>
+            </wp:cNvGraphicFramePr>
+            <a:graphic xmlns:a="http://schemas.openxmlformats.org/drawingml/2006/main">
+              <a:graphicData uri="http://schemas.openxmlformats.org/drawingml/2006/picture">
+                <pic:pic xmlns:pic="http://schemas.openxmlformats.org/drawingml/2006/picture">
+                  <pic:nvPicPr>
+                    <pic:cNvPr id="74972581" name=""/>
+                    <pic:cNvPicPr/>
+                  </pic:nvPicPr>
+                  <pic:blipFill>
+                    <a:blip r:embed="rId9"/>
+                    <a:stretch>
+                      <a:fillRect/>
+                    </a:stretch>
+                  </pic:blipFill>
+                  <pic:spPr>
+                    <a:xfrm>
+                      <a:off x="0" y="0"/>
+                      <a:ext cx="5731510" cy="6896100"/>
+                    </a:xfrm>
+                    <a:prstGeom prst="rect">
+                      <a:avLst/>
+                    </a:prstGeom>
+                  </pic:spPr>
+                </pic:pic>
+              </a:graphicData>
+            </a:graphic>
+          </wp:inline>
+        </w:drawing>
+      </w:r>
+    </w:p>
+    <w:p>
+      <w:pPr>
+        <w:rPr>
+          <w:color w:val="FF0000"/>
+        </w:rPr>
+      </w:pPr>
+      <w:r>
+        <w:rPr>
+          <w:color w:val="FF0000"/>
+        </w:rPr>
+        <w:lastRenderedPageBreak/>
+        <w:drawing>
+          <wp:inline distT="0" distB="0" distL="0" distR="0" wp14:anchorId="2A00D0A0" wp14:editId="21003453">
+            <wp:extent cx="5731510" cy="8023225"/>
+            <wp:effectExtent l="0" t="0" r="2540" b="0"/>
+            <wp:docPr id="1648254132" name="Picture 1"/>
+            <wp:cNvGraphicFramePr>
+              <a:graphicFrameLocks xmlns:a="http://schemas.openxmlformats.org/drawingml/2006/main" noChangeAspect="1"/>
+            </wp:cNvGraphicFramePr>
+            <a:graphic xmlns:a="http://schemas.openxmlformats.org/drawingml/2006/main">
+              <a:graphicData uri="http://schemas.openxmlformats.org/drawingml/2006/picture">
+                <pic:pic xmlns:pic="http://schemas.openxmlformats.org/drawingml/2006/picture">
+                  <pic:nvPicPr>
+                    <pic:cNvPr id="1648254132" name=""/>
+                    <pic:cNvPicPr/>
+                  </pic:nvPicPr>
+                  <pic:blipFill>
+                    <a:blip r:embed="rId10"/>
+                    <a:stretch>
+                      <a:fillRect/>
+                    </a:stretch>
+                  </pic:blipFill>
+                  <pic:spPr>
+                    <a:xfrm>
+                      <a:off x="0" y="0"/>
+                      <a:ext cx="5731510" cy="8023225"/>
+                    </a:xfrm>
+                    <a:prstGeom prst="rect">
+                      <a:avLst/>
+                    </a:prstGeom>
+                  </pic:spPr>
+                </pic:pic>
+              </a:graphicData>
+            </a:graphic>
+          </wp:inline>
+        </w:drawing>
+      </w:r>
+    </w:p>
+    <w:p>
+      <w:pPr>
+        <w:rPr>
+          <w:color w:val="FF0000"/>
+        </w:rPr>
+      </w:pPr>
+      <w:r>
+        <w:rPr>
+          <w:color w:val="FF0000"/>
+        </w:rPr>
+        <w:lastRenderedPageBreak/>
+        <w:drawing>
+          <wp:inline distT="0" distB="0" distL="0" distR="0" wp14:anchorId="7CB12600" wp14:editId="7D818E59">
+            <wp:extent cx="5731510" cy="3867150"/>
+            <wp:effectExtent l="0" t="0" r="2540" b="0"/>
+            <wp:docPr id="2030917298" name="Picture 1"/>
+            <wp:cNvGraphicFramePr>
+              <a:graphicFrameLocks xmlns:a="http://schemas.openxmlformats.org/drawingml/2006/main" noChangeAspect="1"/>
+            </wp:cNvGraphicFramePr>
+            <a:graphic xmlns:a="http://schemas.openxmlformats.org/drawingml/2006/main">
+              <a:graphicData uri="http://schemas.openxmlformats.org/drawingml/2006/picture">
+                <pic:pic xmlns:pic="http://schemas.openxmlformats.org/drawingml/2006/picture">
+                  <pic:nvPicPr>
+                    <pic:cNvPr id="2030917298" name=""/>
+                    <pic:cNvPicPr/>
+                  </pic:nvPicPr>
+                  <pic:blipFill>
+                    <a:blip r:embed="rId11"/>
+                    <a:stretch>
+                      <a:fillRect/>
+                    </a:stretch>
+                  </pic:blipFill>
+                  <pic:spPr>
+                    <a:xfrm>
+                      <a:off x="0" y="0"/>
+                      <a:ext cx="5731510" cy="3867150"/>
+                    </a:xfrm>
+                    <a:prstGeom prst="rect">
+                      <a:avLst/>
+                    </a:prstGeom>
+                  </pic:spPr>
+                </pic:pic>
+              </a:graphicData>
+            </a:graphic>
+          </wp:inline>
+        </w:drawing>
+      </w:r>
     </w:p>
     <w:p>
       <w:pPr>
@@ -235,7 +371,7 @@
           </w:placeholder>
         </w:sdtPr>
         <w:sdtContent>
-          <w:hyperlink r:id="rId9" w:history="1">
+          <w:hyperlink r:id="rId12" w:history="1">
             <w:r>
               <w:rPr>
                 <w:rStyle w:val="Hyperlink"/>
@@ -420,12 +556,12 @@
       </w:sdtContent>
     </w:sdt>
     <w:sectPr>
-      <w:headerReference w:type="even" r:id="rId10"/>
-      <w:headerReference w:type="default" r:id="rId11"/>
-      <w:footerReference w:type="even" r:id="rId12"/>
-      <w:footerReference w:type="default" r:id="rId13"/>
-      <w:headerReference w:type="first" r:id="rId14"/>
-      <w:footerReference w:type="first" r:id="rId15"/>
+      <w:headerReference w:type="even" r:id="rId13"/>
+      <w:headerReference w:type="default" r:id="rId14"/>
+      <w:footerReference w:type="even" r:id="rId15"/>
+      <w:footerReference w:type="default" r:id="rId16"/>
+      <w:headerReference w:type="first" r:id="rId17"/>
+      <w:footerReference w:type="first" r:id="rId18"/>
       <w:pgSz w:w="11906" w:h="16838"/>
       <w:pgMar w:top="1440" w:right="1440" w:bottom="1440" w:left="1440" w:header="170" w:footer="708" w:gutter="0"/>
       <w:cols w:space="708"/>
@@ -2997,6 +3133,7 @@
     <w:rsidRoot w:val="00D1226A"/>
     <w:rsid w:val="0038413C"/>
     <w:rsid w:val="00610C97"/>
+    <w:rsid w:val="006C4313"/>
     <w:rsid w:val="007B5075"/>
     <w:rsid w:val="008B0955"/>
     <w:rsid w:val="00980631"/>
@@ -3004,7 +3141,6 @@
     <w:rsid w:val="00AC5F97"/>
     <w:rsid w:val="00B56AD6"/>
     <w:rsid w:val="00D1226A"/>
-    <w:rsid w:val="00DD32FF"/>
   </w:rsids>
   <m:mathPr>
     <m:mathFont m:val="Cambria Math"/>

</xml_diff>